<commit_message>
Done demo oauth2 JWT
</commit_message>
<xml_diff>
--- a/Tuan01/22671312_DangHoangViet_Report.docx
+++ b/Tuan01/22671312_DangHoangViet_Report.docx
@@ -3,7 +3,58 @@
 <w:document xmlns:wpc="http://schemas.microsoft.com/office/word/2010/wordprocessingCanvas" xmlns:cx="http://schemas.microsoft.com/office/drawing/2014/chartex" xmlns:cx1="http://schemas.microsoft.com/office/drawing/2015/9/8/chartex" xmlns:cx2="http://schemas.microsoft.com/office/drawing/2015/10/21/chartex" xmlns:cx3="http://schemas.microsoft.com/office/drawing/2016/5/9/chartex" xmlns:cx4="http://schemas.microsoft.com/office/drawing/2016/5/10/chartex" xmlns:cx5="http://schemas.microsoft.com/office/drawing/2016/5/11/chartex" xmlns:cx6="http://schemas.microsoft.com/office/drawing/2016/5/12/chartex" xmlns:cx7="http://schemas.microsoft.com/office/drawing/2016/5/13/chartex" xmlns:cx8="http://schemas.microsoft.com/office/drawing/2016/5/14/chartex" xmlns:mc="http://schemas.openxmlformats.org/markup-compatibility/2006" xmlns:aink="http://schemas.microsoft.com/office/drawing/2016/ink" xmlns:am3d="http://schemas.microsoft.com/office/drawing/2017/model3d" xmlns:o="urn:schemas-microsoft-com:office:office" xmlns:oel="http://schemas.microsoft.com/office/2019/extlst" xmlns:r="http://schemas.openxmlformats.org/officeDocument/2006/relationships" xmlns:m="http://schemas.openxmlformats.org/officeDocument/2006/math" xmlns:v="urn:schemas-microsoft-com:vml" xmlns:wp14="http://schemas.microsoft.com/office/word/2010/wordprocessingDrawing" xmlns:wp="http://schemas.openxmlformats.org/drawingml/2006/wordprocessingDrawing" xmlns:w10="urn:schemas-microsoft-com:office:word" xmlns:w="http://schemas.openxmlformats.org/wordprocessingml/2006/main" xmlns:w14="http://schemas.microsoft.com/office/word/2010/wordml" xmlns:w15="http://schemas.microsoft.com/office/word/2012/wordml" xmlns:w16cex="http://schemas.microsoft.com/office/word/2018/wordml/cex" xmlns:w16cid="http://schemas.microsoft.com/office/word/2016/wordml/cid" xmlns:w16="http://schemas.microsoft.com/office/word/2018/wordml" xmlns:w16du="http://schemas.microsoft.com/office/word/2023/wordml/word16du" xmlns:w16sdtdh="http://schemas.microsoft.com/office/word/2020/wordml/sdtdatahash" xmlns:w16sdtfl="http://schemas.microsoft.com/office/word/2024/wordml/sdtformatlock" xmlns:w16se="http://schemas.microsoft.com/office/word/2015/wordml/symex" xmlns:wpg="http://schemas.microsoft.com/office/word/2010/wordprocessingGroup" xmlns:wpi="http://schemas.microsoft.com/office/word/2010/wordprocessingInk" xmlns:wne="http://schemas.microsoft.com/office/word/2006/wordml" xmlns:wps="http://schemas.microsoft.com/office/word/2010/wordprocessingShape" mc:Ignorable="w14 w15 w16se w16cid w16 w16cex w16sdtdh w16sdtfl w16du wp14">
   <w:body>
     <w:p>
-      <w:r>
+      <w:pPr>
+        <w:rPr>
+          <w:rFonts w:ascii="Times New Roman" w:hAnsi="Times New Roman" w:cs="Times New Roman"/>
+          <w:sz w:val="26"/>
+          <w:szCs w:val="26"/>
+        </w:rPr>
+      </w:pPr>
+      <w:r>
+        <w:rPr>
+          <w:rFonts w:ascii="Times New Roman" w:hAnsi="Times New Roman" w:cs="Times New Roman"/>
+          <w:sz w:val="26"/>
+          <w:szCs w:val="26"/>
+        </w:rPr>
+        <w:t>Đặng Hoàng Việt – 22671321</w:t>
+      </w:r>
+    </w:p>
+    <w:p>
+      <w:pPr>
+        <w:rPr>
+          <w:rFonts w:ascii="Times New Roman" w:hAnsi="Times New Roman" w:cs="Times New Roman"/>
+          <w:b/>
+          <w:bCs/>
+          <w:sz w:val="26"/>
+          <w:szCs w:val="26"/>
+        </w:rPr>
+      </w:pPr>
+      <w:r>
+        <w:rPr>
+          <w:rFonts w:ascii="Times New Roman" w:hAnsi="Times New Roman" w:cs="Times New Roman"/>
+          <w:b/>
+          <w:bCs/>
+          <w:sz w:val="26"/>
+          <w:szCs w:val="26"/>
+        </w:rPr>
+        <w:t>Bài 1: Rabbitmq_nodejs</w:t>
+      </w:r>
+    </w:p>
+    <w:p>
+      <w:pPr>
+        <w:rPr>
+          <w:rFonts w:ascii="Times New Roman" w:hAnsi="Times New Roman" w:cs="Times New Roman"/>
+          <w:sz w:val="26"/>
+          <w:szCs w:val="26"/>
+        </w:rPr>
+      </w:pPr>
+      <w:r>
+        <w:rPr>
+          <w:rFonts w:ascii="Times New Roman" w:hAnsi="Times New Roman" w:cs="Times New Roman"/>
+          <w:noProof/>
+          <w:sz w:val="26"/>
+          <w:szCs w:val="26"/>
+        </w:rPr>
         <w:drawing>
           <wp:inline distT="0" distB="0" distL="0" distR="0" wp14:anchorId="07C051EA" wp14:editId="4A81D3CC">
             <wp:extent cx="5943600" cy="4443095"/>
@@ -20,7 +71,7 @@
                     <pic:cNvPicPr/>
                   </pic:nvPicPr>
                   <pic:blipFill>
-                    <a:blip r:embed="rId4"/>
+                    <a:blip r:embed="rId5"/>
                     <a:stretch>
                       <a:fillRect/>
                     </a:stretch>
@@ -41,6 +92,12 @@
         </w:drawing>
       </w:r>
       <w:r>
+        <w:rPr>
+          <w:rFonts w:ascii="Times New Roman" w:hAnsi="Times New Roman" w:cs="Times New Roman"/>
+          <w:noProof/>
+          <w:sz w:val="26"/>
+          <w:szCs w:val="26"/>
+        </w:rPr>
         <w:drawing>
           <wp:inline distT="0" distB="0" distL="0" distR="0" wp14:anchorId="013ED26D" wp14:editId="60724E85">
             <wp:extent cx="5943600" cy="2675890"/>
@@ -57,7 +114,7 @@
                     <pic:cNvPicPr/>
                   </pic:nvPicPr>
                   <pic:blipFill>
-                    <a:blip r:embed="rId5"/>
+                    <a:blip r:embed="rId6"/>
                     <a:stretch>
                       <a:fillRect/>
                     </a:stretch>
@@ -78,16 +135,56 @@
         </w:drawing>
       </w:r>
     </w:p>
-    <w:p/>
-    <w:p/>
-    <w:p>
-      <w:r>
+    <w:p>
+      <w:pPr>
+        <w:rPr>
+          <w:rFonts w:ascii="Times New Roman" w:hAnsi="Times New Roman" w:cs="Times New Roman"/>
+          <w:sz w:val="26"/>
+          <w:szCs w:val="26"/>
+        </w:rPr>
+      </w:pPr>
+    </w:p>
+    <w:p>
+      <w:pPr>
+        <w:rPr>
+          <w:rFonts w:ascii="Times New Roman" w:hAnsi="Times New Roman" w:cs="Times New Roman"/>
+          <w:sz w:val="26"/>
+          <w:szCs w:val="26"/>
+        </w:rPr>
+      </w:pPr>
+    </w:p>
+    <w:p>
+      <w:pPr>
+        <w:rPr>
+          <w:rFonts w:ascii="Times New Roman" w:hAnsi="Times New Roman" w:cs="Times New Roman"/>
+          <w:sz w:val="26"/>
+          <w:szCs w:val="26"/>
+        </w:rPr>
+      </w:pPr>
+      <w:r>
+        <w:rPr>
+          <w:rFonts w:ascii="Times New Roman" w:hAnsi="Times New Roman" w:cs="Times New Roman"/>
+          <w:sz w:val="26"/>
+          <w:szCs w:val="26"/>
+        </w:rPr>
         <w:t>Trường hợp lỗi:</w:t>
       </w:r>
     </w:p>
     <w:p>
-      <w:r>
-        <w:lastRenderedPageBreak/>
+      <w:pPr>
+        <w:rPr>
+          <w:rFonts w:ascii="Times New Roman" w:hAnsi="Times New Roman" w:cs="Times New Roman"/>
+          <w:sz w:val="26"/>
+          <w:szCs w:val="26"/>
+        </w:rPr>
+      </w:pPr>
+      <w:r>
+        <w:rPr>
+          <w:rFonts w:ascii="Times New Roman" w:hAnsi="Times New Roman" w:cs="Times New Roman"/>
+          <w:noProof/>
+          <w:sz w:val="26"/>
+          <w:szCs w:val="26"/>
+        </w:rPr>
         <w:drawing>
           <wp:inline distT="0" distB="0" distL="0" distR="0" wp14:anchorId="160C305E" wp14:editId="4ABA298D">
             <wp:extent cx="5943600" cy="3342005"/>
@@ -101,45 +198,6 @@
                 <pic:pic xmlns:pic="http://schemas.openxmlformats.org/drawingml/2006/picture">
                   <pic:nvPicPr>
                     <pic:cNvPr id="1763867984" name=""/>
-                    <pic:cNvPicPr/>
-                  </pic:nvPicPr>
-                  <pic:blipFill>
-                    <a:blip r:embed="rId6"/>
-                    <a:stretch>
-                      <a:fillRect/>
-                    </a:stretch>
-                  </pic:blipFill>
-                  <pic:spPr>
-                    <a:xfrm>
-                      <a:off x="0" y="0"/>
-                      <a:ext cx="5943600" cy="3342005"/>
-                    </a:xfrm>
-                    <a:prstGeom prst="rect">
-                      <a:avLst/>
-                    </a:prstGeom>
-                  </pic:spPr>
-                </pic:pic>
-              </a:graphicData>
-            </a:graphic>
-          </wp:inline>
-        </w:drawing>
-      </w:r>
-    </w:p>
-    <w:p>
-      <w:r>
-        <w:drawing>
-          <wp:inline distT="0" distB="0" distL="0" distR="0" wp14:anchorId="3D843A8F" wp14:editId="42FCA9B0">
-            <wp:extent cx="5943600" cy="3342005"/>
-            <wp:effectExtent l="0" t="0" r="0" b="0"/>
-            <wp:docPr id="1756694180" name="Picture 1"/>
-            <wp:cNvGraphicFramePr>
-              <a:graphicFrameLocks xmlns:a="http://schemas.openxmlformats.org/drawingml/2006/main" noChangeAspect="1"/>
-            </wp:cNvGraphicFramePr>
-            <a:graphic xmlns:a="http://schemas.openxmlformats.org/drawingml/2006/main">
-              <a:graphicData uri="http://schemas.openxmlformats.org/drawingml/2006/picture">
-                <pic:pic xmlns:pic="http://schemas.openxmlformats.org/drawingml/2006/picture">
-                  <pic:nvPicPr>
-                    <pic:cNvPr id="1756694180" name=""/>
                     <pic:cNvPicPr/>
                   </pic:nvPicPr>
                   <pic:blipFill>
@@ -165,13 +223,25 @@
       </w:r>
     </w:p>
     <w:p>
-      <w:r>
-        <w:lastRenderedPageBreak/>
+      <w:pPr>
+        <w:rPr>
+          <w:rFonts w:ascii="Times New Roman" w:hAnsi="Times New Roman" w:cs="Times New Roman"/>
+          <w:sz w:val="26"/>
+          <w:szCs w:val="26"/>
+        </w:rPr>
+      </w:pPr>
+      <w:r>
+        <w:rPr>
+          <w:rFonts w:ascii="Times New Roman" w:hAnsi="Times New Roman" w:cs="Times New Roman"/>
+          <w:noProof/>
+          <w:sz w:val="26"/>
+          <w:szCs w:val="26"/>
+        </w:rPr>
         <w:drawing>
-          <wp:inline distT="0" distB="0" distL="0" distR="0" wp14:anchorId="694B2387" wp14:editId="09AC159B">
+          <wp:inline distT="0" distB="0" distL="0" distR="0" wp14:anchorId="3D843A8F" wp14:editId="42FCA9B0">
             <wp:extent cx="5943600" cy="3342005"/>
             <wp:effectExtent l="0" t="0" r="0" b="0"/>
-            <wp:docPr id="449685031" name="Picture 1"/>
+            <wp:docPr id="1756694180" name="Picture 1"/>
             <wp:cNvGraphicFramePr>
               <a:graphicFrameLocks xmlns:a="http://schemas.openxmlformats.org/drawingml/2006/main" noChangeAspect="1"/>
             </wp:cNvGraphicFramePr>
@@ -179,7 +249,7 @@
               <a:graphicData uri="http://schemas.openxmlformats.org/drawingml/2006/picture">
                 <pic:pic xmlns:pic="http://schemas.openxmlformats.org/drawingml/2006/picture">
                   <pic:nvPicPr>
-                    <pic:cNvPr id="449685031" name=""/>
+                    <pic:cNvPr id="1756694180" name=""/>
                     <pic:cNvPicPr/>
                   </pic:nvPicPr>
                   <pic:blipFill>
@@ -204,6 +274,1219 @@
         </w:drawing>
       </w:r>
     </w:p>
+    <w:p>
+      <w:pPr>
+        <w:rPr>
+          <w:rFonts w:ascii="Times New Roman" w:hAnsi="Times New Roman" w:cs="Times New Roman"/>
+          <w:sz w:val="26"/>
+          <w:szCs w:val="26"/>
+        </w:rPr>
+      </w:pPr>
+      <w:r>
+        <w:rPr>
+          <w:rFonts w:ascii="Times New Roman" w:hAnsi="Times New Roman" w:cs="Times New Roman"/>
+          <w:noProof/>
+          <w:sz w:val="26"/>
+          <w:szCs w:val="26"/>
+        </w:rPr>
+        <w:lastRenderedPageBreak/>
+        <w:drawing>
+          <wp:inline distT="0" distB="0" distL="0" distR="0" wp14:anchorId="694B2387" wp14:editId="09AC159B">
+            <wp:extent cx="5943600" cy="3342005"/>
+            <wp:effectExtent l="0" t="0" r="0" b="0"/>
+            <wp:docPr id="449685031" name="Picture 1"/>
+            <wp:cNvGraphicFramePr>
+              <a:graphicFrameLocks xmlns:a="http://schemas.openxmlformats.org/drawingml/2006/main" noChangeAspect="1"/>
+            </wp:cNvGraphicFramePr>
+            <a:graphic xmlns:a="http://schemas.openxmlformats.org/drawingml/2006/main">
+              <a:graphicData uri="http://schemas.openxmlformats.org/drawingml/2006/picture">
+                <pic:pic xmlns:pic="http://schemas.openxmlformats.org/drawingml/2006/picture">
+                  <pic:nvPicPr>
+                    <pic:cNvPr id="449685031" name=""/>
+                    <pic:cNvPicPr/>
+                  </pic:nvPicPr>
+                  <pic:blipFill>
+                    <a:blip r:embed="rId9"/>
+                    <a:stretch>
+                      <a:fillRect/>
+                    </a:stretch>
+                  </pic:blipFill>
+                  <pic:spPr>
+                    <a:xfrm>
+                      <a:off x="0" y="0"/>
+                      <a:ext cx="5943600" cy="3342005"/>
+                    </a:xfrm>
+                    <a:prstGeom prst="rect">
+                      <a:avLst/>
+                    </a:prstGeom>
+                  </pic:spPr>
+                </pic:pic>
+              </a:graphicData>
+            </a:graphic>
+          </wp:inline>
+        </w:drawing>
+      </w:r>
+    </w:p>
+    <w:p>
+      <w:pPr>
+        <w:rPr>
+          <w:rFonts w:ascii="Times New Roman" w:hAnsi="Times New Roman" w:cs="Times New Roman"/>
+          <w:sz w:val="26"/>
+          <w:szCs w:val="26"/>
+        </w:rPr>
+      </w:pPr>
+    </w:p>
+    <w:p>
+      <w:pPr>
+        <w:rPr>
+          <w:rFonts w:ascii="Times New Roman" w:hAnsi="Times New Roman" w:cs="Times New Roman"/>
+          <w:sz w:val="26"/>
+          <w:szCs w:val="26"/>
+        </w:rPr>
+      </w:pPr>
+    </w:p>
+    <w:p>
+      <w:pPr>
+        <w:rPr>
+          <w:rFonts w:ascii="Times New Roman" w:hAnsi="Times New Roman" w:cs="Times New Roman"/>
+          <w:sz w:val="26"/>
+          <w:szCs w:val="26"/>
+        </w:rPr>
+      </w:pPr>
+      <w:r>
+        <w:rPr>
+          <w:rFonts w:ascii="Times New Roman" w:hAnsi="Times New Roman" w:cs="Times New Roman"/>
+          <w:sz w:val="26"/>
+          <w:szCs w:val="26"/>
+        </w:rPr>
+        <w:t>Bài 2: oauth2_resource_server:</w:t>
+      </w:r>
+    </w:p>
+    <w:p>
+      <w:pPr>
+        <w:ind w:firstLine="0"/>
+        <w:rPr>
+          <w:rFonts w:ascii="Times New Roman" w:hAnsi="Times New Roman" w:cs="Times New Roman"/>
+          <w:sz w:val="26"/>
+          <w:szCs w:val="26"/>
+        </w:rPr>
+      </w:pPr>
+      <w:r>
+        <w:rPr>
+          <w:rFonts w:ascii="Times New Roman" w:hAnsi="Times New Roman" w:cs="Times New Roman"/>
+          <w:b/>
+          <w:bCs/>
+          <w:sz w:val="26"/>
+          <w:szCs w:val="26"/>
+        </w:rPr>
+        <w:t xml:space="preserve">Bước 1: </w:t>
+      </w:r>
+      <w:r>
+        <w:rPr>
+          <w:rFonts w:ascii="Times New Roman" w:hAnsi="Times New Roman" w:cs="Times New Roman"/>
+          <w:b/>
+          <w:bCs/>
+          <w:sz w:val="26"/>
+          <w:szCs w:val="26"/>
+        </w:rPr>
+        <w:t>Xây dựng &amp; khởi chạy (Docker):</w:t>
+      </w:r>
+      <w:r>
+        <w:rPr>
+          <w:rFonts w:ascii="Times New Roman" w:hAnsi="Times New Roman" w:cs="Times New Roman"/>
+          <w:sz w:val="26"/>
+          <w:szCs w:val="26"/>
+        </w:rPr>
+        <w:t xml:space="preserve"> Trong thư mục oauth2_resource_server, chạy lệnh docker compose up --build. Đợi cho đến khi cả ba dịch vụ đều hoạt động (auth-server:8080, resource-server:8081, client:3000).</w:t>
+      </w:r>
+    </w:p>
+    <w:p>
+      <w:pPr>
+        <w:ind w:firstLine="0"/>
+        <w:rPr>
+          <w:rFonts w:ascii="Times New Roman" w:hAnsi="Times New Roman" w:cs="Times New Roman"/>
+          <w:sz w:val="26"/>
+          <w:szCs w:val="26"/>
+        </w:rPr>
+      </w:pPr>
+      <w:r>
+        <w:rPr>
+          <w:rFonts w:ascii="Times New Roman" w:hAnsi="Times New Roman" w:cs="Times New Roman"/>
+          <w:sz w:val="26"/>
+          <w:szCs w:val="26"/>
+        </w:rPr>
+        <w:lastRenderedPageBreak/>
+        <w:drawing>
+          <wp:inline distT="0" distB="0" distL="0" distR="0" wp14:anchorId="5F8264E0" wp14:editId="585EDA7D">
+            <wp:extent cx="5943600" cy="3426460"/>
+            <wp:effectExtent l="0" t="0" r="0" b="2540"/>
+            <wp:docPr id="1297963567" name="Picture 1"/>
+            <wp:cNvGraphicFramePr>
+              <a:graphicFrameLocks xmlns:a="http://schemas.openxmlformats.org/drawingml/2006/main" noChangeAspect="1"/>
+            </wp:cNvGraphicFramePr>
+            <a:graphic xmlns:a="http://schemas.openxmlformats.org/drawingml/2006/main">
+              <a:graphicData uri="http://schemas.openxmlformats.org/drawingml/2006/picture">
+                <pic:pic xmlns:pic="http://schemas.openxmlformats.org/drawingml/2006/picture">
+                  <pic:nvPicPr>
+                    <pic:cNvPr id="1297963567" name=""/>
+                    <pic:cNvPicPr/>
+                  </pic:nvPicPr>
+                  <pic:blipFill>
+                    <a:blip r:embed="rId10"/>
+                    <a:stretch>
+                      <a:fillRect/>
+                    </a:stretch>
+                  </pic:blipFill>
+                  <pic:spPr>
+                    <a:xfrm>
+                      <a:off x="0" y="0"/>
+                      <a:ext cx="5943600" cy="3426460"/>
+                    </a:xfrm>
+                    <a:prstGeom prst="rect">
+                      <a:avLst/>
+                    </a:prstGeom>
+                  </pic:spPr>
+                </pic:pic>
+              </a:graphicData>
+            </a:graphic>
+          </wp:inline>
+        </w:drawing>
+      </w:r>
+    </w:p>
+    <w:p>
+      <w:pPr>
+        <w:ind w:firstLine="0"/>
+        <w:rPr>
+          <w:rFonts w:ascii="Times New Roman" w:hAnsi="Times New Roman" w:cs="Times New Roman"/>
+          <w:sz w:val="26"/>
+          <w:szCs w:val="26"/>
+        </w:rPr>
+      </w:pPr>
+      <w:r>
+        <w:rPr>
+          <w:rFonts w:ascii="Times New Roman" w:hAnsi="Times New Roman" w:cs="Times New Roman"/>
+          <w:b/>
+          <w:bCs/>
+          <w:sz w:val="26"/>
+          <w:szCs w:val="26"/>
+        </w:rPr>
+        <w:t>Bước 2:</w:t>
+      </w:r>
+      <w:r>
+        <w:rPr>
+          <w:rFonts w:ascii="Times New Roman" w:hAnsi="Times New Roman" w:cs="Times New Roman"/>
+          <w:sz w:val="26"/>
+          <w:szCs w:val="26"/>
+        </w:rPr>
+        <w:t xml:space="preserve"> </w:t>
+      </w:r>
+      <w:r>
+        <w:rPr>
+          <w:rFonts w:ascii="Times New Roman" w:hAnsi="Times New Roman" w:cs="Times New Roman"/>
+          <w:b/>
+          <w:bCs/>
+          <w:sz w:val="26"/>
+          <w:szCs w:val="26"/>
+        </w:rPr>
+        <w:t>Kiểm tra trạng thái (Health checks):</w:t>
+      </w:r>
+    </w:p>
+    <w:p>
+      <w:pPr>
+        <w:pStyle w:val="ListParagraph"/>
+        <w:numPr>
+          <w:ilvl w:val="0"/>
+          <w:numId w:val="3"/>
+        </w:numPr>
+        <w:rPr>
+          <w:rFonts w:ascii="Times New Roman" w:hAnsi="Times New Roman" w:cs="Times New Roman"/>
+          <w:sz w:val="26"/>
+          <w:szCs w:val="26"/>
+        </w:rPr>
+      </w:pPr>
+      <w:r>
+        <w:rPr>
+          <w:rFonts w:ascii="Times New Roman" w:hAnsi="Times New Roman" w:cs="Times New Roman"/>
+          <w:b/>
+          <w:bCs/>
+          <w:sz w:val="26"/>
+          <w:szCs w:val="26"/>
+        </w:rPr>
+        <w:t>Client:</w:t>
+      </w:r>
+      <w:r>
+        <w:rPr>
+          <w:rFonts w:ascii="Times New Roman" w:hAnsi="Times New Roman" w:cs="Times New Roman"/>
+          <w:sz w:val="26"/>
+          <w:szCs w:val="26"/>
+        </w:rPr>
+        <w:t xml:space="preserve"> curl </w:t>
+      </w:r>
+      <w:hyperlink r:id="rId11" w:history="1">
+        <w:r>
+          <w:rPr>
+            <w:rStyle w:val="Hyperlink"/>
+            <w:rFonts w:ascii="Times New Roman" w:hAnsi="Times New Roman" w:cs="Times New Roman"/>
+            <w:sz w:val="26"/>
+            <w:szCs w:val="26"/>
+          </w:rPr>
+          <w:t>http://localhost:3000/h</w:t>
+        </w:r>
+        <w:r>
+          <w:rPr>
+            <w:rStyle w:val="Hyperlink"/>
+            <w:rFonts w:ascii="Times New Roman" w:hAnsi="Times New Roman" w:cs="Times New Roman"/>
+            <w:sz w:val="26"/>
+            <w:szCs w:val="26"/>
+          </w:rPr>
+          <w:t>e</w:t>
+        </w:r>
+        <w:r>
+          <w:rPr>
+            <w:rStyle w:val="Hyperlink"/>
+            <w:rFonts w:ascii="Times New Roman" w:hAnsi="Times New Roman" w:cs="Times New Roman"/>
+            <w:sz w:val="26"/>
+            <w:szCs w:val="26"/>
+          </w:rPr>
+          <w:t>alth</w:t>
+        </w:r>
+      </w:hyperlink>
+    </w:p>
+    <w:p>
+      <w:pPr>
+        <w:ind w:left="360" w:firstLine="0"/>
+        <w:rPr>
+          <w:rFonts w:ascii="Times New Roman" w:hAnsi="Times New Roman" w:cs="Times New Roman"/>
+          <w:sz w:val="26"/>
+          <w:szCs w:val="26"/>
+        </w:rPr>
+      </w:pPr>
+      <w:r>
+        <w:rPr>
+          <w:rFonts w:ascii="Times New Roman" w:hAnsi="Times New Roman" w:cs="Times New Roman"/>
+          <w:sz w:val="26"/>
+          <w:szCs w:val="26"/>
+        </w:rPr>
+        <w:drawing>
+          <wp:inline distT="0" distB="0" distL="0" distR="0" wp14:anchorId="235723B7" wp14:editId="6101DCF3">
+            <wp:extent cx="4201111" cy="2781688"/>
+            <wp:effectExtent l="0" t="0" r="9525" b="0"/>
+            <wp:docPr id="1405543980" name="Picture 1"/>
+            <wp:cNvGraphicFramePr>
+              <a:graphicFrameLocks xmlns:a="http://schemas.openxmlformats.org/drawingml/2006/main" noChangeAspect="1"/>
+            </wp:cNvGraphicFramePr>
+            <a:graphic xmlns:a="http://schemas.openxmlformats.org/drawingml/2006/main">
+              <a:graphicData uri="http://schemas.openxmlformats.org/drawingml/2006/picture">
+                <pic:pic xmlns:pic="http://schemas.openxmlformats.org/drawingml/2006/picture">
+                  <pic:nvPicPr>
+                    <pic:cNvPr id="1405543980" name=""/>
+                    <pic:cNvPicPr/>
+                  </pic:nvPicPr>
+                  <pic:blipFill>
+                    <a:blip r:embed="rId12"/>
+                    <a:stretch>
+                      <a:fillRect/>
+                    </a:stretch>
+                  </pic:blipFill>
+                  <pic:spPr>
+                    <a:xfrm>
+                      <a:off x="0" y="0"/>
+                      <a:ext cx="4201111" cy="2781688"/>
+                    </a:xfrm>
+                    <a:prstGeom prst="rect">
+                      <a:avLst/>
+                    </a:prstGeom>
+                  </pic:spPr>
+                </pic:pic>
+              </a:graphicData>
+            </a:graphic>
+          </wp:inline>
+        </w:drawing>
+      </w:r>
+    </w:p>
+    <w:p>
+      <w:pPr>
+        <w:pStyle w:val="ListParagraph"/>
+        <w:numPr>
+          <w:ilvl w:val="0"/>
+          <w:numId w:val="3"/>
+        </w:numPr>
+        <w:rPr>
+          <w:rFonts w:ascii="Times New Roman" w:hAnsi="Times New Roman" w:cs="Times New Roman"/>
+          <w:sz w:val="26"/>
+          <w:szCs w:val="26"/>
+        </w:rPr>
+      </w:pPr>
+      <w:r>
+        <w:rPr>
+          <w:rFonts w:ascii="Times New Roman" w:hAnsi="Times New Roman" w:cs="Times New Roman"/>
+          <w:b/>
+          <w:bCs/>
+          <w:sz w:val="26"/>
+          <w:szCs w:val="26"/>
+        </w:rPr>
+        <w:t>Auth:</w:t>
+      </w:r>
+      <w:r>
+        <w:rPr>
+          <w:rFonts w:ascii="Times New Roman" w:hAnsi="Times New Roman" w:cs="Times New Roman"/>
+          <w:sz w:val="26"/>
+          <w:szCs w:val="26"/>
+        </w:rPr>
+        <w:t xml:space="preserve"> curl </w:t>
+      </w:r>
+      <w:hyperlink r:id="rId13" w:history="1">
+        <w:r>
+          <w:rPr>
+            <w:rStyle w:val="Hyperlink"/>
+            <w:rFonts w:ascii="Times New Roman" w:hAnsi="Times New Roman" w:cs="Times New Roman"/>
+            <w:sz w:val="26"/>
+            <w:szCs w:val="26"/>
+          </w:rPr>
+          <w:t>http://localhost:80</w:t>
+        </w:r>
+        <w:r>
+          <w:rPr>
+            <w:rStyle w:val="Hyperlink"/>
+            <w:rFonts w:ascii="Times New Roman" w:hAnsi="Times New Roman" w:cs="Times New Roman"/>
+            <w:sz w:val="26"/>
+            <w:szCs w:val="26"/>
+          </w:rPr>
+          <w:t>8</w:t>
+        </w:r>
+        <w:r>
+          <w:rPr>
+            <w:rStyle w:val="Hyperlink"/>
+            <w:rFonts w:ascii="Times New Roman" w:hAnsi="Times New Roman" w:cs="Times New Roman"/>
+            <w:sz w:val="26"/>
+            <w:szCs w:val="26"/>
+          </w:rPr>
+          <w:t>0/oauth2/health</w:t>
+        </w:r>
+      </w:hyperlink>
+    </w:p>
+    <w:p>
+      <w:pPr>
+        <w:ind w:left="360" w:firstLine="0"/>
+        <w:rPr>
+          <w:rFonts w:ascii="Times New Roman" w:hAnsi="Times New Roman" w:cs="Times New Roman"/>
+          <w:sz w:val="26"/>
+          <w:szCs w:val="26"/>
+        </w:rPr>
+      </w:pPr>
+      <w:r>
+        <w:rPr>
+          <w:rFonts w:ascii="Times New Roman" w:hAnsi="Times New Roman" w:cs="Times New Roman"/>
+          <w:sz w:val="26"/>
+          <w:szCs w:val="26"/>
+        </w:rPr>
+        <w:lastRenderedPageBreak/>
+        <w:drawing>
+          <wp:inline distT="0" distB="0" distL="0" distR="0" wp14:anchorId="33008E3D" wp14:editId="127E78B6">
+            <wp:extent cx="5943600" cy="2538095"/>
+            <wp:effectExtent l="0" t="0" r="0" b="0"/>
+            <wp:docPr id="35483294" name="Picture 1"/>
+            <wp:cNvGraphicFramePr>
+              <a:graphicFrameLocks xmlns:a="http://schemas.openxmlformats.org/drawingml/2006/main" noChangeAspect="1"/>
+            </wp:cNvGraphicFramePr>
+            <a:graphic xmlns:a="http://schemas.openxmlformats.org/drawingml/2006/main">
+              <a:graphicData uri="http://schemas.openxmlformats.org/drawingml/2006/picture">
+                <pic:pic xmlns:pic="http://schemas.openxmlformats.org/drawingml/2006/picture">
+                  <pic:nvPicPr>
+                    <pic:cNvPr id="35483294" name=""/>
+                    <pic:cNvPicPr/>
+                  </pic:nvPicPr>
+                  <pic:blipFill>
+                    <a:blip r:embed="rId14"/>
+                    <a:stretch>
+                      <a:fillRect/>
+                    </a:stretch>
+                  </pic:blipFill>
+                  <pic:spPr>
+                    <a:xfrm>
+                      <a:off x="0" y="0"/>
+                      <a:ext cx="5943600" cy="2538095"/>
+                    </a:xfrm>
+                    <a:prstGeom prst="rect">
+                      <a:avLst/>
+                    </a:prstGeom>
+                  </pic:spPr>
+                </pic:pic>
+              </a:graphicData>
+            </a:graphic>
+          </wp:inline>
+        </w:drawing>
+      </w:r>
+    </w:p>
+    <w:p>
+      <w:pPr>
+        <w:pStyle w:val="ListParagraph"/>
+        <w:numPr>
+          <w:ilvl w:val="0"/>
+          <w:numId w:val="3"/>
+        </w:numPr>
+        <w:rPr>
+          <w:rFonts w:ascii="Times New Roman" w:hAnsi="Times New Roman" w:cs="Times New Roman"/>
+          <w:sz w:val="26"/>
+          <w:szCs w:val="26"/>
+        </w:rPr>
+      </w:pPr>
+      <w:r>
+        <w:rPr>
+          <w:rFonts w:ascii="Times New Roman" w:hAnsi="Times New Roman" w:cs="Times New Roman"/>
+          <w:b/>
+          <w:bCs/>
+          <w:sz w:val="26"/>
+          <w:szCs w:val="26"/>
+        </w:rPr>
+        <w:t>Resource:</w:t>
+      </w:r>
+      <w:r>
+        <w:rPr>
+          <w:rFonts w:ascii="Times New Roman" w:hAnsi="Times New Roman" w:cs="Times New Roman"/>
+          <w:sz w:val="26"/>
+          <w:szCs w:val="26"/>
+        </w:rPr>
+        <w:t xml:space="preserve"> curl </w:t>
+      </w:r>
+      <w:hyperlink r:id="rId15" w:history="1">
+        <w:r>
+          <w:rPr>
+            <w:rStyle w:val="Hyperlink"/>
+            <w:rFonts w:ascii="Times New Roman" w:hAnsi="Times New Roman" w:cs="Times New Roman"/>
+            <w:sz w:val="26"/>
+            <w:szCs w:val="26"/>
+          </w:rPr>
+          <w:t>http://localhost:8081</w:t>
+        </w:r>
+        <w:r>
+          <w:rPr>
+            <w:rStyle w:val="Hyperlink"/>
+            <w:rFonts w:ascii="Times New Roman" w:hAnsi="Times New Roman" w:cs="Times New Roman"/>
+            <w:sz w:val="26"/>
+            <w:szCs w:val="26"/>
+          </w:rPr>
+          <w:t>/</w:t>
+        </w:r>
+        <w:r>
+          <w:rPr>
+            <w:rStyle w:val="Hyperlink"/>
+            <w:rFonts w:ascii="Times New Roman" w:hAnsi="Times New Roman" w:cs="Times New Roman"/>
+            <w:sz w:val="26"/>
+            <w:szCs w:val="26"/>
+          </w:rPr>
+          <w:t>health</w:t>
+        </w:r>
+      </w:hyperlink>
+    </w:p>
+    <w:p>
+      <w:pPr>
+        <w:ind w:left="454" w:firstLine="0"/>
+        <w:rPr>
+          <w:rFonts w:ascii="Times New Roman" w:hAnsi="Times New Roman" w:cs="Times New Roman"/>
+          <w:sz w:val="26"/>
+          <w:szCs w:val="26"/>
+        </w:rPr>
+      </w:pPr>
+    </w:p>
+    <w:p>
+      <w:pPr>
+        <w:ind w:firstLine="0"/>
+        <w:rPr>
+          <w:rFonts w:ascii="Times New Roman" w:hAnsi="Times New Roman" w:cs="Times New Roman"/>
+          <w:sz w:val="26"/>
+          <w:szCs w:val="26"/>
+        </w:rPr>
+      </w:pPr>
+      <w:r>
+        <w:rPr>
+          <w:rFonts w:ascii="Times New Roman" w:hAnsi="Times New Roman" w:cs="Times New Roman"/>
+          <w:sz w:val="26"/>
+          <w:szCs w:val="26"/>
+        </w:rPr>
+        <w:drawing>
+          <wp:inline distT="0" distB="0" distL="0" distR="0" wp14:anchorId="3A47976C" wp14:editId="0FF4F765">
+            <wp:extent cx="5943600" cy="2468245"/>
+            <wp:effectExtent l="0" t="0" r="0" b="8255"/>
+            <wp:docPr id="46721968" name="Picture 1"/>
+            <wp:cNvGraphicFramePr>
+              <a:graphicFrameLocks xmlns:a="http://schemas.openxmlformats.org/drawingml/2006/main" noChangeAspect="1"/>
+            </wp:cNvGraphicFramePr>
+            <a:graphic xmlns:a="http://schemas.openxmlformats.org/drawingml/2006/main">
+              <a:graphicData uri="http://schemas.openxmlformats.org/drawingml/2006/picture">
+                <pic:pic xmlns:pic="http://schemas.openxmlformats.org/drawingml/2006/picture">
+                  <pic:nvPicPr>
+                    <pic:cNvPr id="46721968" name=""/>
+                    <pic:cNvPicPr/>
+                  </pic:nvPicPr>
+                  <pic:blipFill>
+                    <a:blip r:embed="rId16"/>
+                    <a:stretch>
+                      <a:fillRect/>
+                    </a:stretch>
+                  </pic:blipFill>
+                  <pic:spPr>
+                    <a:xfrm>
+                      <a:off x="0" y="0"/>
+                      <a:ext cx="5943600" cy="2468245"/>
+                    </a:xfrm>
+                    <a:prstGeom prst="rect">
+                      <a:avLst/>
+                    </a:prstGeom>
+                  </pic:spPr>
+                </pic:pic>
+              </a:graphicData>
+            </a:graphic>
+          </wp:inline>
+        </w:drawing>
+      </w:r>
+    </w:p>
+    <w:p>
+      <w:pPr>
+        <w:ind w:firstLine="0"/>
+        <w:rPr>
+          <w:rFonts w:ascii="Times New Roman" w:hAnsi="Times New Roman" w:cs="Times New Roman"/>
+          <w:sz w:val="26"/>
+          <w:szCs w:val="26"/>
+        </w:rPr>
+      </w:pPr>
+      <w:r>
+        <w:rPr>
+          <w:rFonts w:ascii="Times New Roman" w:hAnsi="Times New Roman" w:cs="Times New Roman"/>
+          <w:b/>
+          <w:bCs/>
+          <w:sz w:val="26"/>
+          <w:szCs w:val="26"/>
+        </w:rPr>
+        <w:t xml:space="preserve">Bước 3: </w:t>
+      </w:r>
+      <w:r>
+        <w:rPr>
+          <w:rFonts w:ascii="Times New Roman" w:hAnsi="Times New Roman" w:cs="Times New Roman"/>
+          <w:b/>
+          <w:bCs/>
+          <w:sz w:val="26"/>
+          <w:szCs w:val="26"/>
+        </w:rPr>
+        <w:t>Đăng nhập để lấy token:</w:t>
+      </w:r>
+      <w:r>
+        <w:rPr>
+          <w:rFonts w:ascii="Times New Roman" w:hAnsi="Times New Roman" w:cs="Times New Roman"/>
+          <w:sz w:val="26"/>
+          <w:szCs w:val="26"/>
+        </w:rPr>
+        <w:t xml:space="preserve"> curl -X POST http://localhost:3000/login -H "Content-Type: application/json" -d '{"username":"user1","password":"password123"}'</w:t>
+      </w:r>
+    </w:p>
+    <w:p>
+      <w:pPr>
+        <w:ind w:firstLine="0"/>
+        <w:rPr>
+          <w:rFonts w:ascii="Times New Roman" w:hAnsi="Times New Roman" w:cs="Times New Roman"/>
+          <w:sz w:val="26"/>
+          <w:szCs w:val="26"/>
+        </w:rPr>
+      </w:pPr>
+      <w:r>
+        <w:rPr>
+          <w:rFonts w:ascii="Times New Roman" w:hAnsi="Times New Roman" w:cs="Times New Roman"/>
+          <w:sz w:val="26"/>
+          <w:szCs w:val="26"/>
+        </w:rPr>
+        <w:lastRenderedPageBreak/>
+        <w:drawing>
+          <wp:inline distT="0" distB="0" distL="0" distR="0" wp14:anchorId="3BB07367" wp14:editId="21658638">
+            <wp:extent cx="5943600" cy="3342005"/>
+            <wp:effectExtent l="0" t="0" r="0" b="0"/>
+            <wp:docPr id="833405876" name="Picture 1"/>
+            <wp:cNvGraphicFramePr>
+              <a:graphicFrameLocks xmlns:a="http://schemas.openxmlformats.org/drawingml/2006/main" noChangeAspect="1"/>
+            </wp:cNvGraphicFramePr>
+            <a:graphic xmlns:a="http://schemas.openxmlformats.org/drawingml/2006/main">
+              <a:graphicData uri="http://schemas.openxmlformats.org/drawingml/2006/picture">
+                <pic:pic xmlns:pic="http://schemas.openxmlformats.org/drawingml/2006/picture">
+                  <pic:nvPicPr>
+                    <pic:cNvPr id="833405876" name=""/>
+                    <pic:cNvPicPr/>
+                  </pic:nvPicPr>
+                  <pic:blipFill>
+                    <a:blip r:embed="rId17"/>
+                    <a:stretch>
+                      <a:fillRect/>
+                    </a:stretch>
+                  </pic:blipFill>
+                  <pic:spPr>
+                    <a:xfrm>
+                      <a:off x="0" y="0"/>
+                      <a:ext cx="5943600" cy="3342005"/>
+                    </a:xfrm>
+                    <a:prstGeom prst="rect">
+                      <a:avLst/>
+                    </a:prstGeom>
+                  </pic:spPr>
+                </pic:pic>
+              </a:graphicData>
+            </a:graphic>
+          </wp:inline>
+        </w:drawing>
+      </w:r>
+    </w:p>
+    <w:p>
+      <w:pPr>
+        <w:ind w:firstLine="0"/>
+        <w:rPr>
+          <w:rFonts w:ascii="Times New Roman" w:hAnsi="Times New Roman" w:cs="Times New Roman"/>
+          <w:sz w:val="26"/>
+          <w:szCs w:val="26"/>
+        </w:rPr>
+      </w:pPr>
+    </w:p>
+    <w:p>
+      <w:pPr>
+        <w:ind w:firstLine="0"/>
+        <w:rPr>
+          <w:rFonts w:ascii="Times New Roman" w:hAnsi="Times New Roman" w:cs="Times New Roman"/>
+          <w:sz w:val="26"/>
+          <w:szCs w:val="26"/>
+        </w:rPr>
+      </w:pPr>
+      <w:r>
+        <w:rPr>
+          <w:rFonts w:ascii="Times New Roman" w:hAnsi="Times New Roman" w:cs="Times New Roman"/>
+          <w:b/>
+          <w:bCs/>
+          <w:sz w:val="26"/>
+          <w:szCs w:val="26"/>
+        </w:rPr>
+        <w:t>Tài nguyên công khai (không cần token):</w:t>
+      </w:r>
+      <w:r>
+        <w:rPr>
+          <w:rFonts w:ascii="Times New Roman" w:hAnsi="Times New Roman" w:cs="Times New Roman"/>
+          <w:sz w:val="26"/>
+          <w:szCs w:val="26"/>
+        </w:rPr>
+        <w:t xml:space="preserve"> curl </w:t>
+      </w:r>
+      <w:hyperlink r:id="rId18" w:history="1">
+        <w:r>
+          <w:rPr>
+            <w:rStyle w:val="Hyperlink"/>
+            <w:rFonts w:ascii="Times New Roman" w:hAnsi="Times New Roman" w:cs="Times New Roman"/>
+            <w:sz w:val="26"/>
+            <w:szCs w:val="26"/>
+          </w:rPr>
+          <w:t>http://localhost:3</w:t>
+        </w:r>
+        <w:r>
+          <w:rPr>
+            <w:rStyle w:val="Hyperlink"/>
+            <w:rFonts w:ascii="Times New Roman" w:hAnsi="Times New Roman" w:cs="Times New Roman"/>
+            <w:sz w:val="26"/>
+            <w:szCs w:val="26"/>
+          </w:rPr>
+          <w:t>0</w:t>
+        </w:r>
+        <w:r>
+          <w:rPr>
+            <w:rStyle w:val="Hyperlink"/>
+            <w:rFonts w:ascii="Times New Roman" w:hAnsi="Times New Roman" w:cs="Times New Roman"/>
+            <w:sz w:val="26"/>
+            <w:szCs w:val="26"/>
+          </w:rPr>
+          <w:t>00/public-resource</w:t>
+        </w:r>
+      </w:hyperlink>
+      <w:r>
+        <w:rPr>
+          <w:rFonts w:ascii="Times New Roman" w:hAnsi="Times New Roman" w:cs="Times New Roman"/>
+          <w:sz w:val="26"/>
+          <w:szCs w:val="26"/>
+        </w:rPr>
+        <w:t>.</w:t>
+      </w:r>
+    </w:p>
+    <w:p>
+      <w:pPr>
+        <w:ind w:firstLine="0"/>
+        <w:rPr>
+          <w:rFonts w:ascii="Times New Roman" w:hAnsi="Times New Roman" w:cs="Times New Roman"/>
+          <w:sz w:val="26"/>
+          <w:szCs w:val="26"/>
+        </w:rPr>
+      </w:pPr>
+      <w:r>
+        <w:rPr>
+          <w:rFonts w:ascii="Times New Roman" w:hAnsi="Times New Roman" w:cs="Times New Roman"/>
+          <w:sz w:val="26"/>
+          <w:szCs w:val="26"/>
+        </w:rPr>
+        <w:drawing>
+          <wp:inline distT="0" distB="0" distL="0" distR="0" wp14:anchorId="68EE7877" wp14:editId="6F707B31">
+            <wp:extent cx="5943600" cy="1754505"/>
+            <wp:effectExtent l="0" t="0" r="0" b="0"/>
+            <wp:docPr id="1431827276" name="Picture 1"/>
+            <wp:cNvGraphicFramePr>
+              <a:graphicFrameLocks xmlns:a="http://schemas.openxmlformats.org/drawingml/2006/main" noChangeAspect="1"/>
+            </wp:cNvGraphicFramePr>
+            <a:graphic xmlns:a="http://schemas.openxmlformats.org/drawingml/2006/main">
+              <a:graphicData uri="http://schemas.openxmlformats.org/drawingml/2006/picture">
+                <pic:pic xmlns:pic="http://schemas.openxmlformats.org/drawingml/2006/picture">
+                  <pic:nvPicPr>
+                    <pic:cNvPr id="1431827276" name=""/>
+                    <pic:cNvPicPr/>
+                  </pic:nvPicPr>
+                  <pic:blipFill>
+                    <a:blip r:embed="rId19"/>
+                    <a:stretch>
+                      <a:fillRect/>
+                    </a:stretch>
+                  </pic:blipFill>
+                  <pic:spPr>
+                    <a:xfrm>
+                      <a:off x="0" y="0"/>
+                      <a:ext cx="5943600" cy="1754505"/>
+                    </a:xfrm>
+                    <a:prstGeom prst="rect">
+                      <a:avLst/>
+                    </a:prstGeom>
+                  </pic:spPr>
+                </pic:pic>
+              </a:graphicData>
+            </a:graphic>
+          </wp:inline>
+        </w:drawing>
+      </w:r>
+    </w:p>
+    <w:p>
+      <w:pPr>
+        <w:ind w:firstLine="0"/>
+        <w:rPr>
+          <w:rFonts w:ascii="Times New Roman" w:hAnsi="Times New Roman" w:cs="Times New Roman"/>
+          <w:sz w:val="26"/>
+          <w:szCs w:val="26"/>
+        </w:rPr>
+      </w:pPr>
+    </w:p>
+    <w:p>
+      <w:pPr>
+        <w:ind w:firstLine="0"/>
+        <w:rPr>
+          <w:rFonts w:ascii="Times New Roman" w:hAnsi="Times New Roman" w:cs="Times New Roman"/>
+          <w:sz w:val="26"/>
+          <w:szCs w:val="26"/>
+        </w:rPr>
+      </w:pPr>
+      <w:r>
+        <w:rPr>
+          <w:rFonts w:ascii="Times New Roman" w:hAnsi="Times New Roman" w:cs="Times New Roman"/>
+          <w:b/>
+          <w:bCs/>
+          <w:sz w:val="26"/>
+          <w:szCs w:val="26"/>
+        </w:rPr>
+        <w:t>Tài nguyên người dùng (cần token):</w:t>
+      </w:r>
+      <w:r>
+        <w:rPr>
+          <w:rFonts w:ascii="Times New Roman" w:hAnsi="Times New Roman" w:cs="Times New Roman"/>
+          <w:sz w:val="26"/>
+          <w:szCs w:val="26"/>
+        </w:rPr>
+        <w:t xml:space="preserve"> curl -H "Authorization: Bearer &lt;ACCESS_TOKEN&gt;" </w:t>
+      </w:r>
+      <w:hyperlink r:id="rId20" w:history="1">
+        <w:r>
+          <w:rPr>
+            <w:rStyle w:val="Hyperlink"/>
+            <w:rFonts w:ascii="Times New Roman" w:hAnsi="Times New Roman" w:cs="Times New Roman"/>
+            <w:sz w:val="26"/>
+            <w:szCs w:val="26"/>
+          </w:rPr>
+          <w:t>http://localhost:3000/user-resource</w:t>
+        </w:r>
+      </w:hyperlink>
+      <w:r>
+        <w:rPr>
+          <w:rFonts w:ascii="Times New Roman" w:hAnsi="Times New Roman" w:cs="Times New Roman"/>
+          <w:sz w:val="26"/>
+          <w:szCs w:val="26"/>
+        </w:rPr>
+        <w:t>.</w:t>
+      </w:r>
+    </w:p>
+    <w:p>
+      <w:pPr>
+        <w:ind w:firstLine="0"/>
+        <w:rPr>
+          <w:rFonts w:ascii="Times New Roman" w:hAnsi="Times New Roman" w:cs="Times New Roman"/>
+          <w:sz w:val="26"/>
+          <w:szCs w:val="26"/>
+        </w:rPr>
+      </w:pPr>
+      <w:r>
+        <w:rPr>
+          <w:rFonts w:ascii="Times New Roman" w:hAnsi="Times New Roman" w:cs="Times New Roman"/>
+          <w:sz w:val="26"/>
+          <w:szCs w:val="26"/>
+        </w:rPr>
+        <w:lastRenderedPageBreak/>
+        <w:drawing>
+          <wp:inline distT="0" distB="0" distL="0" distR="0" wp14:anchorId="18EA36A4" wp14:editId="50AAF8A2">
+            <wp:extent cx="5943600" cy="3342005"/>
+            <wp:effectExtent l="0" t="0" r="0" b="0"/>
+            <wp:docPr id="1913465665" name="Picture 1"/>
+            <wp:cNvGraphicFramePr>
+              <a:graphicFrameLocks xmlns:a="http://schemas.openxmlformats.org/drawingml/2006/main" noChangeAspect="1"/>
+            </wp:cNvGraphicFramePr>
+            <a:graphic xmlns:a="http://schemas.openxmlformats.org/drawingml/2006/main">
+              <a:graphicData uri="http://schemas.openxmlformats.org/drawingml/2006/picture">
+                <pic:pic xmlns:pic="http://schemas.openxmlformats.org/drawingml/2006/picture">
+                  <pic:nvPicPr>
+                    <pic:cNvPr id="1913465665" name=""/>
+                    <pic:cNvPicPr/>
+                  </pic:nvPicPr>
+                  <pic:blipFill>
+                    <a:blip r:embed="rId21"/>
+                    <a:stretch>
+                      <a:fillRect/>
+                    </a:stretch>
+                  </pic:blipFill>
+                  <pic:spPr>
+                    <a:xfrm>
+                      <a:off x="0" y="0"/>
+                      <a:ext cx="5943600" cy="3342005"/>
+                    </a:xfrm>
+                    <a:prstGeom prst="rect">
+                      <a:avLst/>
+                    </a:prstGeom>
+                  </pic:spPr>
+                </pic:pic>
+              </a:graphicData>
+            </a:graphic>
+          </wp:inline>
+        </w:drawing>
+      </w:r>
+    </w:p>
+    <w:p>
+      <w:pPr>
+        <w:ind w:firstLine="0"/>
+        <w:rPr>
+          <w:rFonts w:ascii="Times New Roman" w:hAnsi="Times New Roman" w:cs="Times New Roman"/>
+          <w:sz w:val="26"/>
+          <w:szCs w:val="26"/>
+        </w:rPr>
+      </w:pPr>
+    </w:p>
+    <w:p>
+      <w:pPr>
+        <w:ind w:firstLine="0"/>
+        <w:rPr>
+          <w:rFonts w:ascii="Times New Roman" w:hAnsi="Times New Roman" w:cs="Times New Roman"/>
+          <w:sz w:val="26"/>
+          <w:szCs w:val="26"/>
+        </w:rPr>
+      </w:pPr>
+      <w:r>
+        <w:rPr>
+          <w:rFonts w:ascii="Times New Roman" w:hAnsi="Times New Roman" w:cs="Times New Roman"/>
+          <w:b/>
+          <w:bCs/>
+          <w:sz w:val="26"/>
+          <w:szCs w:val="26"/>
+        </w:rPr>
+        <w:t>Tài nguyên quản trị (đăng nhập với tư cách admin):</w:t>
+      </w:r>
+    </w:p>
+    <w:p>
+      <w:pPr>
+        <w:pStyle w:val="ListParagraph"/>
+        <w:numPr>
+          <w:ilvl w:val="0"/>
+          <w:numId w:val="3"/>
+        </w:numPr>
+        <w:rPr>
+          <w:rFonts w:ascii="Times New Roman" w:hAnsi="Times New Roman" w:cs="Times New Roman"/>
+          <w:sz w:val="26"/>
+          <w:szCs w:val="26"/>
+        </w:rPr>
+      </w:pPr>
+      <w:r>
+        <w:rPr>
+          <w:rFonts w:ascii="Times New Roman" w:hAnsi="Times New Roman" w:cs="Times New Roman"/>
+          <w:b/>
+          <w:bCs/>
+          <w:sz w:val="26"/>
+          <w:szCs w:val="26"/>
+        </w:rPr>
+        <w:t>Đăng nhập:</w:t>
+      </w:r>
+      <w:r>
+        <w:rPr>
+          <w:rFonts w:ascii="Times New Roman" w:hAnsi="Times New Roman" w:cs="Times New Roman"/>
+          <w:sz w:val="26"/>
+          <w:szCs w:val="26"/>
+        </w:rPr>
+        <w:t xml:space="preserve"> curl -X POST http://localhost:3000/login -H "Content-Type: application/json" -d '{"username":"admin","password":"admin123"}'</w:t>
+      </w:r>
+    </w:p>
+    <w:p>
+      <w:pPr>
+        <w:rPr>
+          <w:rFonts w:ascii="Times New Roman" w:hAnsi="Times New Roman" w:cs="Times New Roman"/>
+          <w:sz w:val="26"/>
+          <w:szCs w:val="26"/>
+        </w:rPr>
+      </w:pPr>
+    </w:p>
+    <w:p>
+      <w:pPr>
+        <w:rPr>
+          <w:rFonts w:ascii="Times New Roman" w:hAnsi="Times New Roman" w:cs="Times New Roman"/>
+          <w:sz w:val="26"/>
+          <w:szCs w:val="26"/>
+        </w:rPr>
+      </w:pPr>
+      <w:r>
+        <w:rPr>
+          <w:rFonts w:ascii="Times New Roman" w:hAnsi="Times New Roman" w:cs="Times New Roman"/>
+          <w:sz w:val="26"/>
+          <w:szCs w:val="26"/>
+        </w:rPr>
+        <w:drawing>
+          <wp:inline distT="0" distB="0" distL="0" distR="0" wp14:anchorId="1D0C1243" wp14:editId="39413320">
+            <wp:extent cx="5943600" cy="3375660"/>
+            <wp:effectExtent l="0" t="0" r="0" b="0"/>
+            <wp:docPr id="545671960" name="Picture 1"/>
+            <wp:cNvGraphicFramePr>
+              <a:graphicFrameLocks xmlns:a="http://schemas.openxmlformats.org/drawingml/2006/main" noChangeAspect="1"/>
+            </wp:cNvGraphicFramePr>
+            <a:graphic xmlns:a="http://schemas.openxmlformats.org/drawingml/2006/main">
+              <a:graphicData uri="http://schemas.openxmlformats.org/drawingml/2006/picture">
+                <pic:pic xmlns:pic="http://schemas.openxmlformats.org/drawingml/2006/picture">
+                  <pic:nvPicPr>
+                    <pic:cNvPr id="545671960" name=""/>
+                    <pic:cNvPicPr/>
+                  </pic:nvPicPr>
+                  <pic:blipFill>
+                    <a:blip r:embed="rId22"/>
+                    <a:stretch>
+                      <a:fillRect/>
+                    </a:stretch>
+                  </pic:blipFill>
+                  <pic:spPr>
+                    <a:xfrm>
+                      <a:off x="0" y="0"/>
+                      <a:ext cx="5943600" cy="3375660"/>
+                    </a:xfrm>
+                    <a:prstGeom prst="rect">
+                      <a:avLst/>
+                    </a:prstGeom>
+                  </pic:spPr>
+                </pic:pic>
+              </a:graphicData>
+            </a:graphic>
+          </wp:inline>
+        </w:drawing>
+      </w:r>
+    </w:p>
+    <w:p>
+      <w:pPr>
+        <w:pStyle w:val="ListParagraph"/>
+        <w:numPr>
+          <w:ilvl w:val="0"/>
+          <w:numId w:val="3"/>
+        </w:numPr>
+        <w:rPr>
+          <w:rFonts w:ascii="Times New Roman" w:hAnsi="Times New Roman" w:cs="Times New Roman"/>
+          <w:sz w:val="26"/>
+          <w:szCs w:val="26"/>
+        </w:rPr>
+      </w:pPr>
+      <w:r>
+        <w:rPr>
+          <w:rFonts w:ascii="Times New Roman" w:hAnsi="Times New Roman" w:cs="Times New Roman"/>
+          <w:b/>
+          <w:bCs/>
+          <w:sz w:val="26"/>
+          <w:szCs w:val="26"/>
+        </w:rPr>
+        <w:lastRenderedPageBreak/>
+        <w:t>Truy cập:</w:t>
+      </w:r>
+      <w:r>
+        <w:rPr>
+          <w:rFonts w:ascii="Times New Roman" w:hAnsi="Times New Roman" w:cs="Times New Roman"/>
+          <w:sz w:val="26"/>
+          <w:szCs w:val="26"/>
+        </w:rPr>
+        <w:t xml:space="preserve"> curl -H "Authorization: Bearer &lt;ADMIN_TOKEN&gt;" http://localhost:3000/admin-resource.</w:t>
+      </w:r>
+    </w:p>
+    <w:p>
+      <w:pPr>
+        <w:ind w:firstLine="0"/>
+        <w:rPr>
+          <w:rFonts w:ascii="Times New Roman" w:hAnsi="Times New Roman" w:cs="Times New Roman"/>
+          <w:sz w:val="26"/>
+          <w:szCs w:val="26"/>
+        </w:rPr>
+      </w:pPr>
+      <w:r>
+        <w:rPr>
+          <w:rFonts w:ascii="Times New Roman" w:hAnsi="Times New Roman" w:cs="Times New Roman"/>
+          <w:sz w:val="26"/>
+          <w:szCs w:val="26"/>
+        </w:rPr>
+        <w:drawing>
+          <wp:inline distT="0" distB="0" distL="0" distR="0" wp14:anchorId="4A0AA393" wp14:editId="5DE88E23">
+            <wp:extent cx="5943600" cy="3342005"/>
+            <wp:effectExtent l="0" t="0" r="0" b="0"/>
+            <wp:docPr id="59910718" name="Picture 1"/>
+            <wp:cNvGraphicFramePr>
+              <a:graphicFrameLocks xmlns:a="http://schemas.openxmlformats.org/drawingml/2006/main" noChangeAspect="1"/>
+            </wp:cNvGraphicFramePr>
+            <a:graphic xmlns:a="http://schemas.openxmlformats.org/drawingml/2006/main">
+              <a:graphicData uri="http://schemas.openxmlformats.org/drawingml/2006/picture">
+                <pic:pic xmlns:pic="http://schemas.openxmlformats.org/drawingml/2006/picture">
+                  <pic:nvPicPr>
+                    <pic:cNvPr id="59910718" name=""/>
+                    <pic:cNvPicPr/>
+                  </pic:nvPicPr>
+                  <pic:blipFill>
+                    <a:blip r:embed="rId23"/>
+                    <a:stretch>
+                      <a:fillRect/>
+                    </a:stretch>
+                  </pic:blipFill>
+                  <pic:spPr>
+                    <a:xfrm>
+                      <a:off x="0" y="0"/>
+                      <a:ext cx="5943600" cy="3342005"/>
+                    </a:xfrm>
+                    <a:prstGeom prst="rect">
+                      <a:avLst/>
+                    </a:prstGeom>
+                  </pic:spPr>
+                </pic:pic>
+              </a:graphicData>
+            </a:graphic>
+          </wp:inline>
+        </w:drawing>
+      </w:r>
+    </w:p>
+    <w:p>
+      <w:pPr>
+        <w:ind w:firstLine="0"/>
+        <w:rPr>
+          <w:rFonts w:ascii="Times New Roman" w:hAnsi="Times New Roman" w:cs="Times New Roman"/>
+          <w:sz w:val="26"/>
+          <w:szCs w:val="26"/>
+        </w:rPr>
+      </w:pPr>
+    </w:p>
+    <w:p>
+      <w:pPr>
+        <w:ind w:firstLine="0"/>
+        <w:rPr>
+          <w:rFonts w:ascii="Times New Roman" w:hAnsi="Times New Roman" w:cs="Times New Roman"/>
+          <w:sz w:val="26"/>
+          <w:szCs w:val="26"/>
+        </w:rPr>
+      </w:pPr>
+    </w:p>
+    <w:p>
+      <w:pPr>
+        <w:ind w:firstLine="0"/>
+        <w:rPr>
+          <w:rFonts w:ascii="Times New Roman" w:hAnsi="Times New Roman" w:cs="Times New Roman"/>
+          <w:sz w:val="26"/>
+          <w:szCs w:val="26"/>
+        </w:rPr>
+      </w:pPr>
+      <w:r>
+        <w:rPr>
+          <w:rFonts w:ascii="Times New Roman" w:hAnsi="Times New Roman" w:cs="Times New Roman"/>
+          <w:b/>
+          <w:bCs/>
+          <w:sz w:val="26"/>
+          <w:szCs w:val="26"/>
+        </w:rPr>
+        <w:t>Làm mới token (Refresh token):</w:t>
+      </w:r>
+      <w:r>
+        <w:rPr>
+          <w:rFonts w:ascii="Times New Roman" w:hAnsi="Times New Roman" w:cs="Times New Roman"/>
+          <w:sz w:val="26"/>
+          <w:szCs w:val="26"/>
+        </w:rPr>
+        <w:t xml:space="preserve"> curl -X POST http://localhost:3000/refresh-token -H "Content-Type: application/json" -d '{"refresh_token":"&lt;REFRESH_TOKEN&gt;"}'.</w:t>
+      </w:r>
+    </w:p>
+    <w:p>
+      <w:pPr>
+        <w:ind w:firstLine="0"/>
+        <w:rPr>
+          <w:rFonts w:ascii="Times New Roman" w:hAnsi="Times New Roman" w:cs="Times New Roman"/>
+          <w:sz w:val="26"/>
+          <w:szCs w:val="26"/>
+        </w:rPr>
+      </w:pPr>
+    </w:p>
+    <w:p>
+      <w:pPr>
+        <w:ind w:firstLine="0"/>
+        <w:rPr>
+          <w:rFonts w:ascii="Times New Roman" w:hAnsi="Times New Roman" w:cs="Times New Roman"/>
+          <w:sz w:val="26"/>
+          <w:szCs w:val="26"/>
+        </w:rPr>
+      </w:pPr>
+      <w:r>
+        <w:rPr>
+          <w:rFonts w:ascii="Times New Roman" w:hAnsi="Times New Roman" w:cs="Times New Roman"/>
+          <w:sz w:val="26"/>
+          <w:szCs w:val="26"/>
+        </w:rPr>
+        <w:lastRenderedPageBreak/>
+        <w:drawing>
+          <wp:inline distT="0" distB="0" distL="0" distR="0" wp14:anchorId="7FA3D5BB" wp14:editId="5CA202C2">
+            <wp:extent cx="5943600" cy="3342005"/>
+            <wp:effectExtent l="0" t="0" r="0" b="0"/>
+            <wp:docPr id="1879052190" name="Picture 1"/>
+            <wp:cNvGraphicFramePr>
+              <a:graphicFrameLocks xmlns:a="http://schemas.openxmlformats.org/drawingml/2006/main" noChangeAspect="1"/>
+            </wp:cNvGraphicFramePr>
+            <a:graphic xmlns:a="http://schemas.openxmlformats.org/drawingml/2006/main">
+              <a:graphicData uri="http://schemas.openxmlformats.org/drawingml/2006/picture">
+                <pic:pic xmlns:pic="http://schemas.openxmlformats.org/drawingml/2006/picture">
+                  <pic:nvPicPr>
+                    <pic:cNvPr id="1879052190" name=""/>
+                    <pic:cNvPicPr/>
+                  </pic:nvPicPr>
+                  <pic:blipFill>
+                    <a:blip r:embed="rId24"/>
+                    <a:stretch>
+                      <a:fillRect/>
+                    </a:stretch>
+                  </pic:blipFill>
+                  <pic:spPr>
+                    <a:xfrm>
+                      <a:off x="0" y="0"/>
+                      <a:ext cx="5943600" cy="3342005"/>
+                    </a:xfrm>
+                    <a:prstGeom prst="rect">
+                      <a:avLst/>
+                    </a:prstGeom>
+                  </pic:spPr>
+                </pic:pic>
+              </a:graphicData>
+            </a:graphic>
+          </wp:inline>
+        </w:drawing>
+      </w:r>
+    </w:p>
     <w:sectPr>
       <w:pgSz w:w="12240" w:h="15840"/>
       <w:pgMar w:top="1440" w:right="1440" w:bottom="1440" w:left="1440" w:header="720" w:footer="720" w:gutter="0"/>
@@ -212,6 +1495,546 @@
     </w:sectPr>
   </w:body>
 </w:document>
+</file>
+
+<file path=word/numbering.xml><?xml version="1.0" encoding="utf-8"?>
+<w:numbering xmlns:wpc="http://schemas.microsoft.com/office/word/2010/wordprocessingCanvas" xmlns:cx="http://schemas.microsoft.com/office/drawing/2014/chartex" xmlns:cx1="http://schemas.microsoft.com/office/drawing/2015/9/8/chartex" xmlns:cx2="http://schemas.microsoft.com/office/drawing/2015/10/21/chartex" xmlns:cx3="http://schemas.microsoft.com/office/drawing/2016/5/9/chartex" xmlns:cx4="http://schemas.microsoft.com/office/drawing/2016/5/10/chartex" xmlns:cx5="http://schemas.microsoft.com/office/drawing/2016/5/11/chartex" xmlns:cx6="http://schemas.microsoft.com/office/drawing/2016/5/12/chartex" xmlns:cx7="http://schemas.microsoft.com/office/drawing/2016/5/13/chartex" xmlns:cx8="http://schemas.microsoft.com/office/drawing/2016/5/14/chartex" xmlns:mc="http://schemas.openxmlformats.org/markup-compatibility/2006" xmlns:aink="http://schemas.microsoft.com/office/drawing/2016/ink" xmlns:am3d="http://schemas.microsoft.com/office/drawing/2017/model3d" xmlns:o="urn:schemas-microsoft-com:office:office" xmlns:oel="http://schemas.microsoft.com/office/2019/extlst" xmlns:r="http://schemas.openxmlformats.org/officeDocument/2006/relationships" xmlns:m="http://schemas.openxmlformats.org/officeDocument/2006/math" xmlns:v="urn:schemas-microsoft-com:vml" xmlns:wp14="http://schemas.microsoft.com/office/word/2010/wordprocessingDrawing" xmlns:wp="http://schemas.openxmlformats.org/drawingml/2006/wordprocessingDrawing" xmlns:w10="urn:schemas-microsoft-com:office:word" xmlns:w="http://schemas.openxmlformats.org/wordprocessingml/2006/main" xmlns:w14="http://schemas.microsoft.com/office/word/2010/wordml" xmlns:w15="http://schemas.microsoft.com/office/word/2012/wordml" xmlns:w16cex="http://schemas.microsoft.com/office/word/2018/wordml/cex" xmlns:w16cid="http://schemas.microsoft.com/office/word/2016/wordml/cid" xmlns:w16="http://schemas.microsoft.com/office/word/2018/wordml" xmlns:w16du="http://schemas.microsoft.com/office/word/2023/wordml/word16du" xmlns:w16sdtdh="http://schemas.microsoft.com/office/word/2020/wordml/sdtdatahash" xmlns:w16sdtfl="http://schemas.microsoft.com/office/word/2024/wordml/sdtformatlock" xmlns:w16se="http://schemas.microsoft.com/office/word/2015/wordml/symex" xmlns:wpg="http://schemas.microsoft.com/office/word/2010/wordprocessingGroup" xmlns:wpi="http://schemas.microsoft.com/office/word/2010/wordprocessingInk" xmlns:wne="http://schemas.microsoft.com/office/word/2006/wordml" xmlns:wps="http://schemas.microsoft.com/office/word/2010/wordprocessingShape" mc:Ignorable="w14 w15 w16se w16cid w16 w16cex w16sdtdh w16sdtfl w16du wp14">
+  <w:abstractNum w:abstractNumId="0" w15:restartNumberingAfterBreak="0">
+    <w:nsid w:val="15F57F34"/>
+    <w:multiLevelType w:val="hybridMultilevel"/>
+    <w:tmpl w:val="490CC526"/>
+    <w:lvl w:ilvl="0" w:tplc="EB48C328">
+      <w:numFmt w:val="bullet"/>
+      <w:lvlText w:val="-"/>
+      <w:lvlJc w:val="left"/>
+      <w:pPr>
+        <w:ind w:left="814" w:hanging="360"/>
+      </w:pPr>
+      <w:rPr>
+        <w:rFonts w:ascii="Times New Roman" w:eastAsiaTheme="minorHAnsi" w:hAnsi="Times New Roman" w:cs="Times New Roman" w:hint="default"/>
+        <w:b/>
+      </w:rPr>
+    </w:lvl>
+    <w:lvl w:ilvl="1" w:tplc="04090003" w:tentative="1">
+      <w:start w:val="1"/>
+      <w:numFmt w:val="bullet"/>
+      <w:lvlText w:val="o"/>
+      <w:lvlJc w:val="left"/>
+      <w:pPr>
+        <w:ind w:left="1534" w:hanging="360"/>
+      </w:pPr>
+      <w:rPr>
+        <w:rFonts w:ascii="Courier New" w:hAnsi="Courier New" w:cs="Courier New" w:hint="default"/>
+      </w:rPr>
+    </w:lvl>
+    <w:lvl w:ilvl="2" w:tplc="04090005" w:tentative="1">
+      <w:start w:val="1"/>
+      <w:numFmt w:val="bullet"/>
+      <w:lvlText w:val=""/>
+      <w:lvlJc w:val="left"/>
+      <w:pPr>
+        <w:ind w:left="2254" w:hanging="360"/>
+      </w:pPr>
+      <w:rPr>
+        <w:rFonts w:ascii="Wingdings" w:hAnsi="Wingdings" w:hint="default"/>
+      </w:rPr>
+    </w:lvl>
+    <w:lvl w:ilvl="3" w:tplc="04090001" w:tentative="1">
+      <w:start w:val="1"/>
+      <w:numFmt w:val="bullet"/>
+      <w:lvlText w:val=""/>
+      <w:lvlJc w:val="left"/>
+      <w:pPr>
+        <w:ind w:left="2974" w:hanging="360"/>
+      </w:pPr>
+      <w:rPr>
+        <w:rFonts w:ascii="Symbol" w:hAnsi="Symbol" w:hint="default"/>
+      </w:rPr>
+    </w:lvl>
+    <w:lvl w:ilvl="4" w:tplc="04090003" w:tentative="1">
+      <w:start w:val="1"/>
+      <w:numFmt w:val="bullet"/>
+      <w:lvlText w:val="o"/>
+      <w:lvlJc w:val="left"/>
+      <w:pPr>
+        <w:ind w:left="3694" w:hanging="360"/>
+      </w:pPr>
+      <w:rPr>
+        <w:rFonts w:ascii="Courier New" w:hAnsi="Courier New" w:cs="Courier New" w:hint="default"/>
+      </w:rPr>
+    </w:lvl>
+    <w:lvl w:ilvl="5" w:tplc="04090005" w:tentative="1">
+      <w:start w:val="1"/>
+      <w:numFmt w:val="bullet"/>
+      <w:lvlText w:val=""/>
+      <w:lvlJc w:val="left"/>
+      <w:pPr>
+        <w:ind w:left="4414" w:hanging="360"/>
+      </w:pPr>
+      <w:rPr>
+        <w:rFonts w:ascii="Wingdings" w:hAnsi="Wingdings" w:hint="default"/>
+      </w:rPr>
+    </w:lvl>
+    <w:lvl w:ilvl="6" w:tplc="04090001" w:tentative="1">
+      <w:start w:val="1"/>
+      <w:numFmt w:val="bullet"/>
+      <w:lvlText w:val=""/>
+      <w:lvlJc w:val="left"/>
+      <w:pPr>
+        <w:ind w:left="5134" w:hanging="360"/>
+      </w:pPr>
+      <w:rPr>
+        <w:rFonts w:ascii="Symbol" w:hAnsi="Symbol" w:hint="default"/>
+      </w:rPr>
+    </w:lvl>
+    <w:lvl w:ilvl="7" w:tplc="04090003" w:tentative="1">
+      <w:start w:val="1"/>
+      <w:numFmt w:val="bullet"/>
+      <w:lvlText w:val="o"/>
+      <w:lvlJc w:val="left"/>
+      <w:pPr>
+        <w:ind w:left="5854" w:hanging="360"/>
+      </w:pPr>
+      <w:rPr>
+        <w:rFonts w:ascii="Courier New" w:hAnsi="Courier New" w:cs="Courier New" w:hint="default"/>
+      </w:rPr>
+    </w:lvl>
+    <w:lvl w:ilvl="8" w:tplc="04090005" w:tentative="1">
+      <w:start w:val="1"/>
+      <w:numFmt w:val="bullet"/>
+      <w:lvlText w:val=""/>
+      <w:lvlJc w:val="left"/>
+      <w:pPr>
+        <w:ind w:left="6574" w:hanging="360"/>
+      </w:pPr>
+      <w:rPr>
+        <w:rFonts w:ascii="Wingdings" w:hAnsi="Wingdings" w:hint="default"/>
+      </w:rPr>
+    </w:lvl>
+  </w:abstractNum>
+  <w:abstractNum w:abstractNumId="1" w15:restartNumberingAfterBreak="0">
+    <w:nsid w:val="3582713C"/>
+    <w:multiLevelType w:val="hybridMultilevel"/>
+    <w:tmpl w:val="71D46236"/>
+    <w:lvl w:ilvl="0" w:tplc="2B640030">
+      <w:numFmt w:val="bullet"/>
+      <w:lvlText w:val="-"/>
+      <w:lvlJc w:val="left"/>
+      <w:pPr>
+        <w:ind w:left="814" w:hanging="360"/>
+      </w:pPr>
+      <w:rPr>
+        <w:rFonts w:ascii="Times New Roman" w:eastAsiaTheme="minorHAnsi" w:hAnsi="Times New Roman" w:cs="Times New Roman" w:hint="default"/>
+      </w:rPr>
+    </w:lvl>
+    <w:lvl w:ilvl="1" w:tplc="04090003" w:tentative="1">
+      <w:start w:val="1"/>
+      <w:numFmt w:val="bullet"/>
+      <w:lvlText w:val="o"/>
+      <w:lvlJc w:val="left"/>
+      <w:pPr>
+        <w:ind w:left="1534" w:hanging="360"/>
+      </w:pPr>
+      <w:rPr>
+        <w:rFonts w:ascii="Courier New" w:hAnsi="Courier New" w:cs="Courier New" w:hint="default"/>
+      </w:rPr>
+    </w:lvl>
+    <w:lvl w:ilvl="2" w:tplc="04090005" w:tentative="1">
+      <w:start w:val="1"/>
+      <w:numFmt w:val="bullet"/>
+      <w:lvlText w:val=""/>
+      <w:lvlJc w:val="left"/>
+      <w:pPr>
+        <w:ind w:left="2254" w:hanging="360"/>
+      </w:pPr>
+      <w:rPr>
+        <w:rFonts w:ascii="Wingdings" w:hAnsi="Wingdings" w:hint="default"/>
+      </w:rPr>
+    </w:lvl>
+    <w:lvl w:ilvl="3" w:tplc="04090001" w:tentative="1">
+      <w:start w:val="1"/>
+      <w:numFmt w:val="bullet"/>
+      <w:lvlText w:val=""/>
+      <w:lvlJc w:val="left"/>
+      <w:pPr>
+        <w:ind w:left="2974" w:hanging="360"/>
+      </w:pPr>
+      <w:rPr>
+        <w:rFonts w:ascii="Symbol" w:hAnsi="Symbol" w:hint="default"/>
+      </w:rPr>
+    </w:lvl>
+    <w:lvl w:ilvl="4" w:tplc="04090003" w:tentative="1">
+      <w:start w:val="1"/>
+      <w:numFmt w:val="bullet"/>
+      <w:lvlText w:val="o"/>
+      <w:lvlJc w:val="left"/>
+      <w:pPr>
+        <w:ind w:left="3694" w:hanging="360"/>
+      </w:pPr>
+      <w:rPr>
+        <w:rFonts w:ascii="Courier New" w:hAnsi="Courier New" w:cs="Courier New" w:hint="default"/>
+      </w:rPr>
+    </w:lvl>
+    <w:lvl w:ilvl="5" w:tplc="04090005" w:tentative="1">
+      <w:start w:val="1"/>
+      <w:numFmt w:val="bullet"/>
+      <w:lvlText w:val=""/>
+      <w:lvlJc w:val="left"/>
+      <w:pPr>
+        <w:ind w:left="4414" w:hanging="360"/>
+      </w:pPr>
+      <w:rPr>
+        <w:rFonts w:ascii="Wingdings" w:hAnsi="Wingdings" w:hint="default"/>
+      </w:rPr>
+    </w:lvl>
+    <w:lvl w:ilvl="6" w:tplc="04090001" w:tentative="1">
+      <w:start w:val="1"/>
+      <w:numFmt w:val="bullet"/>
+      <w:lvlText w:val=""/>
+      <w:lvlJc w:val="left"/>
+      <w:pPr>
+        <w:ind w:left="5134" w:hanging="360"/>
+      </w:pPr>
+      <w:rPr>
+        <w:rFonts w:ascii="Symbol" w:hAnsi="Symbol" w:hint="default"/>
+      </w:rPr>
+    </w:lvl>
+    <w:lvl w:ilvl="7" w:tplc="04090003" w:tentative="1">
+      <w:start w:val="1"/>
+      <w:numFmt w:val="bullet"/>
+      <w:lvlText w:val="o"/>
+      <w:lvlJc w:val="left"/>
+      <w:pPr>
+        <w:ind w:left="5854" w:hanging="360"/>
+      </w:pPr>
+      <w:rPr>
+        <w:rFonts w:ascii="Courier New" w:hAnsi="Courier New" w:cs="Courier New" w:hint="default"/>
+      </w:rPr>
+    </w:lvl>
+    <w:lvl w:ilvl="8" w:tplc="04090005" w:tentative="1">
+      <w:start w:val="1"/>
+      <w:numFmt w:val="bullet"/>
+      <w:lvlText w:val=""/>
+      <w:lvlJc w:val="left"/>
+      <w:pPr>
+        <w:ind w:left="6574" w:hanging="360"/>
+      </w:pPr>
+      <w:rPr>
+        <w:rFonts w:ascii="Wingdings" w:hAnsi="Wingdings" w:hint="default"/>
+      </w:rPr>
+    </w:lvl>
+  </w:abstractNum>
+  <w:abstractNum w:abstractNumId="2" w15:restartNumberingAfterBreak="0">
+    <w:nsid w:val="518052FA"/>
+    <w:multiLevelType w:val="multilevel"/>
+    <w:tmpl w:val="00F8884A"/>
+    <w:lvl w:ilvl="0">
+      <w:start w:val="1"/>
+      <w:numFmt w:val="bullet"/>
+      <w:lvlText w:val=""/>
+      <w:lvlJc w:val="left"/>
+      <w:pPr>
+        <w:tabs>
+          <w:tab w:val="num" w:pos="720"/>
+        </w:tabs>
+        <w:ind w:left="720" w:hanging="360"/>
+      </w:pPr>
+      <w:rPr>
+        <w:rFonts w:ascii="Symbol" w:hAnsi="Symbol" w:hint="default"/>
+        <w:sz w:val="20"/>
+      </w:rPr>
+    </w:lvl>
+    <w:lvl w:ilvl="1" w:tentative="1">
+      <w:start w:val="1"/>
+      <w:numFmt w:val="bullet"/>
+      <w:lvlText w:val="o"/>
+      <w:lvlJc w:val="left"/>
+      <w:pPr>
+        <w:tabs>
+          <w:tab w:val="num" w:pos="1440"/>
+        </w:tabs>
+        <w:ind w:left="1440" w:hanging="360"/>
+      </w:pPr>
+      <w:rPr>
+        <w:rFonts w:ascii="Courier New" w:hAnsi="Courier New" w:hint="default"/>
+        <w:sz w:val="20"/>
+      </w:rPr>
+    </w:lvl>
+    <w:lvl w:ilvl="2" w:tentative="1">
+      <w:start w:val="1"/>
+      <w:numFmt w:val="bullet"/>
+      <w:lvlText w:val=""/>
+      <w:lvlJc w:val="left"/>
+      <w:pPr>
+        <w:tabs>
+          <w:tab w:val="num" w:pos="2160"/>
+        </w:tabs>
+        <w:ind w:left="2160" w:hanging="360"/>
+      </w:pPr>
+      <w:rPr>
+        <w:rFonts w:ascii="Wingdings" w:hAnsi="Wingdings" w:hint="default"/>
+        <w:sz w:val="20"/>
+      </w:rPr>
+    </w:lvl>
+    <w:lvl w:ilvl="3" w:tentative="1">
+      <w:start w:val="1"/>
+      <w:numFmt w:val="bullet"/>
+      <w:lvlText w:val=""/>
+      <w:lvlJc w:val="left"/>
+      <w:pPr>
+        <w:tabs>
+          <w:tab w:val="num" w:pos="2880"/>
+        </w:tabs>
+        <w:ind w:left="2880" w:hanging="360"/>
+      </w:pPr>
+      <w:rPr>
+        <w:rFonts w:ascii="Wingdings" w:hAnsi="Wingdings" w:hint="default"/>
+        <w:sz w:val="20"/>
+      </w:rPr>
+    </w:lvl>
+    <w:lvl w:ilvl="4" w:tentative="1">
+      <w:start w:val="1"/>
+      <w:numFmt w:val="bullet"/>
+      <w:lvlText w:val=""/>
+      <w:lvlJc w:val="left"/>
+      <w:pPr>
+        <w:tabs>
+          <w:tab w:val="num" w:pos="3600"/>
+        </w:tabs>
+        <w:ind w:left="3600" w:hanging="360"/>
+      </w:pPr>
+      <w:rPr>
+        <w:rFonts w:ascii="Wingdings" w:hAnsi="Wingdings" w:hint="default"/>
+        <w:sz w:val="20"/>
+      </w:rPr>
+    </w:lvl>
+    <w:lvl w:ilvl="5" w:tentative="1">
+      <w:start w:val="1"/>
+      <w:numFmt w:val="bullet"/>
+      <w:lvlText w:val=""/>
+      <w:lvlJc w:val="left"/>
+      <w:pPr>
+        <w:tabs>
+          <w:tab w:val="num" w:pos="4320"/>
+        </w:tabs>
+        <w:ind w:left="4320" w:hanging="360"/>
+      </w:pPr>
+      <w:rPr>
+        <w:rFonts w:ascii="Wingdings" w:hAnsi="Wingdings" w:hint="default"/>
+        <w:sz w:val="20"/>
+      </w:rPr>
+    </w:lvl>
+    <w:lvl w:ilvl="6" w:tentative="1">
+      <w:start w:val="1"/>
+      <w:numFmt w:val="bullet"/>
+      <w:lvlText w:val=""/>
+      <w:lvlJc w:val="left"/>
+      <w:pPr>
+        <w:tabs>
+          <w:tab w:val="num" w:pos="5040"/>
+        </w:tabs>
+        <w:ind w:left="5040" w:hanging="360"/>
+      </w:pPr>
+      <w:rPr>
+        <w:rFonts w:ascii="Wingdings" w:hAnsi="Wingdings" w:hint="default"/>
+        <w:sz w:val="20"/>
+      </w:rPr>
+    </w:lvl>
+    <w:lvl w:ilvl="7" w:tentative="1">
+      <w:start w:val="1"/>
+      <w:numFmt w:val="bullet"/>
+      <w:lvlText w:val=""/>
+      <w:lvlJc w:val="left"/>
+      <w:pPr>
+        <w:tabs>
+          <w:tab w:val="num" w:pos="5760"/>
+        </w:tabs>
+        <w:ind w:left="5760" w:hanging="360"/>
+      </w:pPr>
+      <w:rPr>
+        <w:rFonts w:ascii="Wingdings" w:hAnsi="Wingdings" w:hint="default"/>
+        <w:sz w:val="20"/>
+      </w:rPr>
+    </w:lvl>
+    <w:lvl w:ilvl="8" w:tentative="1">
+      <w:start w:val="1"/>
+      <w:numFmt w:val="bullet"/>
+      <w:lvlText w:val=""/>
+      <w:lvlJc w:val="left"/>
+      <w:pPr>
+        <w:tabs>
+          <w:tab w:val="num" w:pos="6480"/>
+        </w:tabs>
+        <w:ind w:left="6480" w:hanging="360"/>
+      </w:pPr>
+      <w:rPr>
+        <w:rFonts w:ascii="Wingdings" w:hAnsi="Wingdings" w:hint="default"/>
+        <w:sz w:val="20"/>
+      </w:rPr>
+    </w:lvl>
+  </w:abstractNum>
+  <w:abstractNum w:abstractNumId="3" w15:restartNumberingAfterBreak="0">
+    <w:nsid w:val="5B312A14"/>
+    <w:multiLevelType w:val="multilevel"/>
+    <w:tmpl w:val="F2403EE6"/>
+    <w:lvl w:ilvl="0">
+      <w:start w:val="1"/>
+      <w:numFmt w:val="bullet"/>
+      <w:lvlText w:val=""/>
+      <w:lvlJc w:val="left"/>
+      <w:pPr>
+        <w:tabs>
+          <w:tab w:val="num" w:pos="720"/>
+        </w:tabs>
+        <w:ind w:left="720" w:hanging="360"/>
+      </w:pPr>
+      <w:rPr>
+        <w:rFonts w:ascii="Symbol" w:hAnsi="Symbol" w:hint="default"/>
+        <w:sz w:val="20"/>
+      </w:rPr>
+    </w:lvl>
+    <w:lvl w:ilvl="1" w:tentative="1">
+      <w:start w:val="1"/>
+      <w:numFmt w:val="bullet"/>
+      <w:lvlText w:val="o"/>
+      <w:lvlJc w:val="left"/>
+      <w:pPr>
+        <w:tabs>
+          <w:tab w:val="num" w:pos="1440"/>
+        </w:tabs>
+        <w:ind w:left="1440" w:hanging="360"/>
+      </w:pPr>
+      <w:rPr>
+        <w:rFonts w:ascii="Courier New" w:hAnsi="Courier New" w:hint="default"/>
+        <w:sz w:val="20"/>
+      </w:rPr>
+    </w:lvl>
+    <w:lvl w:ilvl="2" w:tentative="1">
+      <w:start w:val="1"/>
+      <w:numFmt w:val="bullet"/>
+      <w:lvlText w:val=""/>
+      <w:lvlJc w:val="left"/>
+      <w:pPr>
+        <w:tabs>
+          <w:tab w:val="num" w:pos="2160"/>
+        </w:tabs>
+        <w:ind w:left="2160" w:hanging="360"/>
+      </w:pPr>
+      <w:rPr>
+        <w:rFonts w:ascii="Wingdings" w:hAnsi="Wingdings" w:hint="default"/>
+        <w:sz w:val="20"/>
+      </w:rPr>
+    </w:lvl>
+    <w:lvl w:ilvl="3" w:tentative="1">
+      <w:start w:val="1"/>
+      <w:numFmt w:val="bullet"/>
+      <w:lvlText w:val=""/>
+      <w:lvlJc w:val="left"/>
+      <w:pPr>
+        <w:tabs>
+          <w:tab w:val="num" w:pos="2880"/>
+        </w:tabs>
+        <w:ind w:left="2880" w:hanging="360"/>
+      </w:pPr>
+      <w:rPr>
+        <w:rFonts w:ascii="Wingdings" w:hAnsi="Wingdings" w:hint="default"/>
+        <w:sz w:val="20"/>
+      </w:rPr>
+    </w:lvl>
+    <w:lvl w:ilvl="4" w:tentative="1">
+      <w:start w:val="1"/>
+      <w:numFmt w:val="bullet"/>
+      <w:lvlText w:val=""/>
+      <w:lvlJc w:val="left"/>
+      <w:pPr>
+        <w:tabs>
+          <w:tab w:val="num" w:pos="3600"/>
+        </w:tabs>
+        <w:ind w:left="3600" w:hanging="360"/>
+      </w:pPr>
+      <w:rPr>
+        <w:rFonts w:ascii="Wingdings" w:hAnsi="Wingdings" w:hint="default"/>
+        <w:sz w:val="20"/>
+      </w:rPr>
+    </w:lvl>
+    <w:lvl w:ilvl="5" w:tentative="1">
+      <w:start w:val="1"/>
+      <w:numFmt w:val="bullet"/>
+      <w:lvlText w:val=""/>
+      <w:lvlJc w:val="left"/>
+      <w:pPr>
+        <w:tabs>
+          <w:tab w:val="num" w:pos="4320"/>
+        </w:tabs>
+        <w:ind w:left="4320" w:hanging="360"/>
+      </w:pPr>
+      <w:rPr>
+        <w:rFonts w:ascii="Wingdings" w:hAnsi="Wingdings" w:hint="default"/>
+        <w:sz w:val="20"/>
+      </w:rPr>
+    </w:lvl>
+    <w:lvl w:ilvl="6" w:tentative="1">
+      <w:start w:val="1"/>
+      <w:numFmt w:val="bullet"/>
+      <w:lvlText w:val=""/>
+      <w:lvlJc w:val="left"/>
+      <w:pPr>
+        <w:tabs>
+          <w:tab w:val="num" w:pos="5040"/>
+        </w:tabs>
+        <w:ind w:left="5040" w:hanging="360"/>
+      </w:pPr>
+      <w:rPr>
+        <w:rFonts w:ascii="Wingdings" w:hAnsi="Wingdings" w:hint="default"/>
+        <w:sz w:val="20"/>
+      </w:rPr>
+    </w:lvl>
+    <w:lvl w:ilvl="7" w:tentative="1">
+      <w:start w:val="1"/>
+      <w:numFmt w:val="bullet"/>
+      <w:lvlText w:val=""/>
+      <w:lvlJc w:val="left"/>
+      <w:pPr>
+        <w:tabs>
+          <w:tab w:val="num" w:pos="5760"/>
+        </w:tabs>
+        <w:ind w:left="5760" w:hanging="360"/>
+      </w:pPr>
+      <w:rPr>
+        <w:rFonts w:ascii="Wingdings" w:hAnsi="Wingdings" w:hint="default"/>
+        <w:sz w:val="20"/>
+      </w:rPr>
+    </w:lvl>
+    <w:lvl w:ilvl="8" w:tentative="1">
+      <w:start w:val="1"/>
+      <w:numFmt w:val="bullet"/>
+      <w:lvlText w:val=""/>
+      <w:lvlJc w:val="left"/>
+      <w:pPr>
+        <w:tabs>
+          <w:tab w:val="num" w:pos="6480"/>
+        </w:tabs>
+        <w:ind w:left="6480" w:hanging="360"/>
+      </w:pPr>
+      <w:rPr>
+        <w:rFonts w:ascii="Wingdings" w:hAnsi="Wingdings" w:hint="default"/>
+        <w:sz w:val="20"/>
+      </w:rPr>
+    </w:lvl>
+  </w:abstractNum>
+  <w:num w:numId="1" w16cid:durableId="1956598883">
+    <w:abstractNumId w:val="1"/>
+  </w:num>
+  <w:num w:numId="2" w16cid:durableId="1973048531">
+    <w:abstractNumId w:val="2"/>
+  </w:num>
+  <w:num w:numId="3" w16cid:durableId="1892375821">
+    <w:abstractNumId w:val="0"/>
+  </w:num>
+  <w:num w:numId="4" w16cid:durableId="898709297">
+    <w:abstractNumId w:val="3"/>
+  </w:num>
+</w:numbering>
 </file>
 
 <file path=word/styles.xml><?xml version="1.0" encoding="utf-8"?>
@@ -821,7 +2644,6 @@
   <w:style w:type="character" w:default="1" w:styleId="DefaultParagraphFont">
     <w:name w:val="Default Paragraph Font"/>
     <w:uiPriority w:val="1"/>
-    <w:semiHidden/>
     <w:unhideWhenUsed/>
   </w:style>
   <w:style w:type="table" w:default="1" w:styleId="TableNormal">
@@ -1135,6 +2957,52 @@
       <w:smallCaps/>
       <w:color w:val="0F4761" w:themeColor="accent1" w:themeShade="BF"/>
       <w:spacing w:val="5"/>
+    </w:rPr>
+  </w:style>
+  <w:style w:type="paragraph" w:styleId="NormalWeb">
+    <w:name w:val="Normal (Web)"/>
+    <w:basedOn w:val="Normal"/>
+    <w:uiPriority w:val="99"/>
+    <w:semiHidden/>
+    <w:unhideWhenUsed/>
+    <w:rsid w:val="00475497"/>
+    <w:rPr>
+      <w:rFonts w:ascii="Times New Roman" w:hAnsi="Times New Roman" w:cs="Times New Roman"/>
+    </w:rPr>
+  </w:style>
+  <w:style w:type="character" w:styleId="Hyperlink">
+    <w:name w:val="Hyperlink"/>
+    <w:basedOn w:val="DefaultParagraphFont"/>
+    <w:uiPriority w:val="99"/>
+    <w:unhideWhenUsed/>
+    <w:rsid w:val="00475497"/>
+    <w:rPr>
+      <w:color w:val="467886" w:themeColor="hyperlink"/>
+      <w:u w:val="single"/>
+    </w:rPr>
+  </w:style>
+  <w:style w:type="character" w:styleId="UnresolvedMention">
+    <w:name w:val="Unresolved Mention"/>
+    <w:basedOn w:val="DefaultParagraphFont"/>
+    <w:uiPriority w:val="99"/>
+    <w:semiHidden/>
+    <w:unhideWhenUsed/>
+    <w:rsid w:val="00475497"/>
+    <w:rPr>
+      <w:color w:val="605E5C"/>
+      <w:shd w:val="clear" w:color="auto" w:fill="E1DFDD"/>
+    </w:rPr>
+  </w:style>
+  <w:style w:type="character" w:styleId="FollowedHyperlink">
+    <w:name w:val="FollowedHyperlink"/>
+    <w:basedOn w:val="DefaultParagraphFont"/>
+    <w:uiPriority w:val="99"/>
+    <w:semiHidden/>
+    <w:unhideWhenUsed/>
+    <w:rsid w:val="00475497"/>
+    <w:rPr>
+      <w:color w:val="96607D" w:themeColor="followedHyperlink"/>
+      <w:u w:val="single"/>
     </w:rPr>
   </w:style>
 </w:styles>

</xml_diff>